<commit_message>
problemas multicast y captura
</commit_message>
<xml_diff>
--- a/Documentacion/Final/Ultima Prueba.docx
+++ b/Documentacion/Final/Ultima Prueba.docx
@@ -231,15 +231,7 @@
       </w:r>
       <w:proofErr w:type="spellEnd"/>
       <w:r>
-        <w:t xml:space="preserve"> diferente a cada uno </w:t>
-      </w:r>
-      <w:proofErr w:type="gramStart"/>
-      <w:r>
-        <w:t>de los host</w:t>
-      </w:r>
-      <w:proofErr w:type="gramEnd"/>
-      <w:r>
-        <w:t xml:space="preserve"> (Notepad, VLC y 7z).</w:t>
+        <w:t xml:space="preserve"> diferente a cada uno de los host (Notepad, VLC y 7z).</w:t>
       </w:r>
       <w:r>
         <w:t xml:space="preserve"> </w:t>
@@ -267,6 +259,68 @@
         </w:rPr>
         <w:t xml:space="preserve"> a un grupo se ve luego en sus hosts asociados).</w:t>
       </w:r>
+    </w:p>
+    <w:p>
+      <w:pPr>
+        <w:rPr>
+          <w:b/>
+          <w:bCs/>
+        </w:rPr>
+      </w:pPr>
+    </w:p>
+    <w:p>
+      <w:pPr>
+        <w:rPr>
+          <w:b/>
+          <w:bCs/>
+        </w:rPr>
+      </w:pPr>
+      <w:r>
+        <w:rPr>
+          <w:b/>
+          <w:bCs/>
+        </w:rPr>
+        <w:t xml:space="preserve">Deja solo un </w:t>
+      </w:r>
+      <w:proofErr w:type="spellStart"/>
+      <w:r>
+        <w:rPr>
+          <w:b/>
+          <w:bCs/>
+        </w:rPr>
+        <w:t>Snapin</w:t>
+      </w:r>
+      <w:proofErr w:type="spellEnd"/>
+      <w:r>
+        <w:rPr>
+          <w:b/>
+          <w:bCs/>
+        </w:rPr>
+        <w:t>??? Tampoco va a veces. Activación de Windows da problema de hardware.</w:t>
+      </w:r>
+    </w:p>
+    <w:p>
+      <w:pPr>
+        <w:rPr>
+          <w:b/>
+          <w:bCs/>
+        </w:rPr>
+      </w:pPr>
+      <w:r>
+        <w:rPr>
+          <w:b/>
+          <w:bCs/>
+        </w:rPr>
+        <w:t>Cliente 07 da problema de hardware y no inicia ¿Crear nuevo o sacar de grupo?</w:t>
+      </w:r>
+    </w:p>
+    <w:p>
+      <w:pPr>
+        <w:rPr>
+          <w:b/>
+          <w:bCs/>
+        </w:rPr>
+      </w:pPr>
     </w:p>
     <w:p/>
     <w:sectPr>

</xml_diff>

<commit_message>
problemas multicast y captura 02
</commit_message>
<xml_diff>
--- a/Documentacion/Final/Ultima Prueba.docx
+++ b/Documentacion/Final/Ultima Prueba.docx
@@ -231,7 +231,15 @@
       </w:r>
       <w:proofErr w:type="spellEnd"/>
       <w:r>
-        <w:t xml:space="preserve"> diferente a cada uno de los host (Notepad, VLC y 7z).</w:t>
+        <w:t xml:space="preserve"> diferente a cada uno </w:t>
+      </w:r>
+      <w:proofErr w:type="gramStart"/>
+      <w:r>
+        <w:t>de los host</w:t>
+      </w:r>
+      <w:proofErr w:type="gramEnd"/>
+      <w:r>
+        <w:t xml:space="preserve"> (Notepad, VLC y 7z).</w:t>
       </w:r>
       <w:r>
         <w:t xml:space="preserve"> </w:t>
@@ -275,6 +283,7 @@
           <w:bCs/>
         </w:rPr>
       </w:pPr>
+      <w:proofErr w:type="gramStart"/>
       <w:r>
         <w:rPr>
           <w:b/>
@@ -296,7 +305,15 @@
           <w:b/>
           <w:bCs/>
         </w:rPr>
-        <w:t>??? Tampoco va a veces. Activación de Windows da problema de hardware.</w:t>
+        <w:t>???</w:t>
+      </w:r>
+      <w:proofErr w:type="gramEnd"/>
+      <w:r>
+        <w:rPr>
+          <w:b/>
+          <w:bCs/>
+        </w:rPr>
+        <w:t xml:space="preserve"> Tampoco va a veces. Activación de Windows da problema de hardware.</w:t>
       </w:r>
     </w:p>
     <w:p>
@@ -321,6 +338,29 @@
           <w:bCs/>
         </w:rPr>
       </w:pPr>
+      <w:r>
+        <w:rPr>
+          <w:b/>
+          <w:bCs/>
+        </w:rPr>
+        <w:t xml:space="preserve">Activar Windows Tras despliegue, con </w:t>
+      </w:r>
+      <w:proofErr w:type="spellStart"/>
+      <w:r>
+        <w:rPr>
+          <w:b/>
+          <w:bCs/>
+        </w:rPr>
+        <w:t>Snapin</w:t>
+      </w:r>
+      <w:proofErr w:type="spellEnd"/>
+      <w:r>
+        <w:rPr>
+          <w:b/>
+          <w:bCs/>
+        </w:rPr>
+        <w:t xml:space="preserve"> sin asociar.</w:t>
+      </w:r>
     </w:p>
     <w:p/>
     <w:sectPr>

</xml_diff>